<commit_message>
Update RP_Odynets.docx and add temp file
Update binary docs/RP_Odynets.docx. A Word temporary file (docs/~$_Odynets.docx) was also added — likely accidental; consider removing it and adding editor/temp file patterns to .gitignore to prevent future commits.
</commit_message>
<xml_diff>
--- a/docs/RP_Odynets.docx
+++ b/docs/RP_Odynets.docx
@@ -636,7 +636,7 @@
                                 <w:b/>
                                 <w:noProof/>
                               </w:rPr>
-                              <w:t>675</w:t>
+                              <w:t>1032</w:t>
                             </w:r>
                             <w:r>
                               <w:rPr>
@@ -664,7 +664,11 @@
           </mc:Choice>
           <mc:Fallback>
             <w:pict>
-              <v:shape w14:anchorId="6326C5C2" id="Text Box 43" o:spid="_x0000_s1028" type="#_x0000_t202" style="position:absolute;left:0;text-align:left;margin-left:0;margin-top:593.7pt;width:402.75pt;height:119.05pt;z-index:251662336;visibility:visible;mso-wrap-style:square;mso-width-percent:1000;mso-height-percent:0;mso-wrap-distance-left:9pt;mso-wrap-distance-top:0;mso-wrap-distance-right:9pt;mso-wrap-distance-bottom:0;mso-position-horizontal:left;mso-position-horizontal-relative:margin;mso-position-vertical:absolute;mso-position-vertical-relative:margin;mso-width-percent:1000;mso-height-percent:0;mso-width-relative:margin;mso-height-relative:margin;v-text-anchor:top" o:gfxdata="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" filled="f" stroked="f">
+              <v:shapetype w14:anchorId="6326C5C2" id="_x0000_t202" coordsize="21600,21600" o:spt="202" path="m,l,21600r21600,l21600,xe">
+                <v:stroke joinstyle="miter"/>
+                <v:path gradientshapeok="t" o:connecttype="rect"/>
+              </v:shapetype>
+              <v:shape id="Text Box 43" o:spid="_x0000_s1028" type="#_x0000_t202" style="position:absolute;left:0;text-align:left;margin-left:0;margin-top:593.7pt;width:402.75pt;height:119.05pt;z-index:251662336;visibility:visible;mso-wrap-style:square;mso-width-percent:1000;mso-height-percent:0;mso-wrap-distance-left:9pt;mso-wrap-distance-top:0;mso-wrap-distance-right:9pt;mso-wrap-distance-bottom:0;mso-position-horizontal:left;mso-position-horizontal-relative:margin;mso-position-vertical:absolute;mso-position-vertical-relative:margin;mso-width-percent:1000;mso-height-percent:0;mso-width-relative:margin;mso-height-relative:margin;v-text-anchor:top" o:gfxdata="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" filled="f" stroked="f">
                 <v:textbox>
                   <w:txbxContent>
                     <w:p>
@@ -912,7 +916,7 @@
                           <w:b/>
                           <w:noProof/>
                         </w:rPr>
-                        <w:t>675</w:t>
+                        <w:t>1032</w:t>
                       </w:r>
                       <w:r>
                         <w:rPr>
@@ -1095,7 +1099,7 @@
           <w:rPr>
             <w:noProof/>
           </w:rPr>
-          <w:t>13.05.2026</w:t>
+          <w:t>14.05.2026</w:t>
         </w:r>
       </w:fldSimple>
       <w:r>
@@ -3269,85 +3273,18 @@
     </w:p>
     <w:p>
       <w:r>
-        <w:t xml:space="preserve">Proč já vlastně tuto práci </w:t>
-      </w:r>
-      <w:r>
-        <w:t>píšu</w:t>
-      </w:r>
-      <w:r>
-        <w:t xml:space="preserve"> …</w:t>
-      </w:r>
-    </w:p>
-    <w:p>
-      <w:pPr>
-        <w:rPr>
-          <w:color w:val="FF0000"/>
-        </w:rPr>
-      </w:pPr>
-      <w:r>
-        <w:rPr>
-          <w:color w:val="FF0000"/>
-        </w:rPr>
-        <w:t xml:space="preserve">Nastavte </w:t>
-      </w:r>
-      <w:r>
-        <w:rPr>
-          <w:b/>
-          <w:bCs/>
-          <w:color w:val="FF0000"/>
-        </w:rPr>
-        <w:t>název</w:t>
-      </w:r>
-      <w:r>
-        <w:rPr>
-          <w:color w:val="FF0000"/>
-        </w:rPr>
-        <w:t xml:space="preserve"> dokumentu a </w:t>
-      </w:r>
-      <w:r>
-        <w:rPr>
-          <w:b/>
-          <w:bCs/>
-          <w:color w:val="FF0000"/>
-        </w:rPr>
-        <w:t>autora</w:t>
-      </w:r>
-      <w:r>
-        <w:rPr>
-          <w:color w:val="FF0000"/>
-        </w:rPr>
-        <w:t xml:space="preserve"> v nabídce Soubor/</w:t>
-      </w:r>
-      <w:r>
-        <w:rPr>
-          <w:color w:val="FF0000"/>
-        </w:rPr>
-        <w:t>Informa</w:t>
-      </w:r>
-      <w:r>
-        <w:rPr>
-          <w:color w:val="FF0000"/>
-        </w:rPr>
-        <w:t>ce</w:t>
-      </w:r>
-      <w:r>
-        <w:rPr>
-          <w:color w:val="FF0000"/>
-        </w:rPr>
-        <w:t>.</w:t>
-      </w:r>
-    </w:p>
-    <w:p>
-      <w:pPr>
-        <w:rPr>
-          <w:color w:val="FF0000"/>
-        </w:rPr>
-      </w:pPr>
-      <w:r>
-        <w:rPr>
-          <w:color w:val="FF0000"/>
-        </w:rPr>
-        <w:t>Pro vkládání zdrojů použijte Reference/Spravovat prameny.</w:t>
+        <w:t>Práce se zabývá vytvořením autonomního autíčka pro sledování čáry, které bude využíváno pro závěrečný programovací projekt prvních ročníku oboru IT. Zahrnuje definování požadavku společně s vedoucím prací (panem Kazdou), výběr komponent, vytvoření 3D modelu podvozku na míru, zapojení a dokumentace procesu sestavení kompletního autíčka s fotodokumentaci.</w:t>
+      </w:r>
+      <w:r>
+        <w:t xml:space="preserve"> Taky byla vytvořená </w:t>
+      </w:r>
+      <w:proofErr w:type="spellStart"/>
+      <w:r>
+        <w:t>MakeCode</w:t>
+      </w:r>
+      <w:proofErr w:type="spellEnd"/>
+      <w:r>
+        <w:t xml:space="preserve"> knihovna pro přesné ovládání krokových motoru z pohledu autíčka.</w:t>
       </w:r>
     </w:p>
     <w:p>
@@ -3370,14 +3307,6 @@
       </w:r>
       <w:r>
         <w:t>, který jsem měl nastudovat a ovládnout.</w:t>
-      </w:r>
-    </w:p>
-    <w:p>
-      <w:pPr>
-        <w:ind w:firstLine="708"/>
-      </w:pPr>
-      <w:r>
-        <w:t>Výsledným 3D modelem by mělo být autíčko pro autonomní sledování čáry, které se může stát základnou pro projekt prvních ročníku oboru IT.</w:t>
       </w:r>
     </w:p>
     <w:p>
@@ -3400,8 +3329,13 @@
         <w:t>Každá součástka budoucího robota potřebuje specifické elektrické požadavky ke správnému fungování</w:t>
       </w:r>
       <w:r>
-        <w:t>, definované v datasheetu</w:t>
-      </w:r>
+        <w:t xml:space="preserve">, definované v </w:t>
+      </w:r>
+      <w:proofErr w:type="spellStart"/>
+      <w:r>
+        <w:t>datasheetu</w:t>
+      </w:r>
+      <w:proofErr w:type="spellEnd"/>
       <w:r>
         <w:t>.</w:t>
       </w:r>
@@ -3546,7 +3480,23 @@
         <w:t>,</w:t>
       </w:r>
       <w:r>
-        <w:t>3V, 5V a 12V.</w:t>
+        <w:t xml:space="preserve">3V, </w:t>
+      </w:r>
+      <w:proofErr w:type="gramStart"/>
+      <w:r>
+        <w:t>5V</w:t>
+      </w:r>
+      <w:proofErr w:type="gramEnd"/>
+      <w:r>
+        <w:t xml:space="preserve"> a </w:t>
+      </w:r>
+      <w:proofErr w:type="gramStart"/>
+      <w:r>
+        <w:t>12V</w:t>
+      </w:r>
+      <w:proofErr w:type="gramEnd"/>
+      <w:r>
+        <w:t>.</w:t>
       </w:r>
       <w:r>
         <w:t xml:space="preserve"> M</w:t>
@@ -3558,10 +3508,28 @@
         <w:t xml:space="preserve">robota </w:t>
       </w:r>
       <w:r>
-        <w:t>(v mém případě Micro:bit) pracuje s nízkým napětím (typicky 3,3 V) a velmi malými proudy</w:t>
-      </w:r>
-      <w:r>
-        <w:t>. Když motory pro svojí práci potřebuji minimálně 5V a mnohem větší spotřebu v mA.</w:t>
+        <w:t xml:space="preserve">(v mém případě </w:t>
+      </w:r>
+      <w:proofErr w:type="spellStart"/>
+      <w:proofErr w:type="gramStart"/>
+      <w:r>
+        <w:t>Micro:bit</w:t>
+      </w:r>
+      <w:proofErr w:type="spellEnd"/>
+      <w:proofErr w:type="gramEnd"/>
+      <w:r>
+        <w:t>) pracuje s nízkým napětím (typicky 3,3 V) a velmi malými proudy</w:t>
+      </w:r>
+      <w:r>
+        <w:t xml:space="preserve">. Když motory pro svojí práci potřebuji minimálně </w:t>
+      </w:r>
+      <w:proofErr w:type="gramStart"/>
+      <w:r>
+        <w:t>5V</w:t>
+      </w:r>
+      <w:proofErr w:type="gramEnd"/>
+      <w:r>
+        <w:t xml:space="preserve"> a mnohem větší spotřebu v mA.</w:t>
       </w:r>
     </w:p>
     <w:p>
@@ -3582,7 +3550,13 @@
         <w:t>součástek</w:t>
       </w:r>
       <w:r>
-        <w:t xml:space="preserve"> by došlo k </w:t>
+        <w:t xml:space="preserve"> by došlo k</w:t>
+      </w:r>
+      <w:r>
+        <w:t>e</w:t>
+      </w:r>
+      <w:r>
+        <w:t> </w:t>
       </w:r>
       <w:r>
         <w:t>spálení</w:t>
@@ -3652,18 +3626,15 @@
         <w:t>specializovaná místa</w:t>
       </w:r>
       <w:r>
-        <w:t xml:space="preserve"> pro každou součástku, což pomáhá optimalizovat využiti místa, definovat cesty pro kabely, </w:t>
-      </w:r>
+        <w:t xml:space="preserve"> pro každou součástku, což pomáhá optimalizovat využiti místa, definovat cesty pro kabely, jejich délku.</w:t>
+      </w:r>
+      <w:r>
+        <w:t xml:space="preserve"> Je to doladěný systém pro specifické použití, který ale v dlouhodobé perspektivě bude lepší volbou.</w:t>
+      </w:r>
+    </w:p>
+    <w:p>
       <w:r>
         <w:lastRenderedPageBreak/>
-        <w:t>jejich délku.</w:t>
-      </w:r>
-      <w:r>
-        <w:t xml:space="preserve"> Je to doladěný systém pro specifické použití, který ale v dlouhodobé perspektivě bude lepší volbou.</w:t>
-      </w:r>
-    </w:p>
-    <w:p>
-      <w:r>
         <w:t>Po uvážení všech za a proti, moje volba padla na solidní podvozek navržený pro specifické komponenty.</w:t>
       </w:r>
     </w:p>
@@ -3682,8 +3653,31 @@
       <w:r>
         <w:t xml:space="preserve">    </w:t>
       </w:r>
-      <w:r>
-        <w:t>Mikrokontrolér: Proč jsi zvolil Micro:bit (+ MakeCode STS).</w:t>
+      <w:proofErr w:type="spellStart"/>
+      <w:r>
+        <w:t>Mikrokontrolér</w:t>
+      </w:r>
+      <w:proofErr w:type="spellEnd"/>
+      <w:r>
+        <w:t xml:space="preserve">: Proč jsi zvolil </w:t>
+      </w:r>
+      <w:proofErr w:type="spellStart"/>
+      <w:proofErr w:type="gramStart"/>
+      <w:r>
+        <w:t>Micro:bit</w:t>
+      </w:r>
+      <w:proofErr w:type="spellEnd"/>
+      <w:proofErr w:type="gramEnd"/>
+      <w:r>
+        <w:t xml:space="preserve"> (+ </w:t>
+      </w:r>
+      <w:proofErr w:type="spellStart"/>
+      <w:r>
+        <w:t>MakeCode</w:t>
+      </w:r>
+      <w:proofErr w:type="spellEnd"/>
+      <w:r>
+        <w:t xml:space="preserve"> STS).</w:t>
       </w:r>
     </w:p>
     <w:p>
@@ -3696,23 +3690,70 @@
         <w:t xml:space="preserve">    Senzory: K čemu slouží IR (sledování čáry) a ultrazvuk (detekce překážek).</w:t>
       </w:r>
     </w:p>
-    <w:p/>
-    <w:p/>
-    <w:p>
-      <w:r>
-        <w:t>Pro nejlepší volbu jsem se poradil</w:t>
-      </w:r>
-    </w:p>
-    <w:p>
-      <w:r>
-        <w:t xml:space="preserve">Po nastudování různých možnosti </w:t>
-      </w:r>
-      <w:r>
-        <w:t xml:space="preserve">jsem se pustil k výběru elektronických součástek pro svoje autíčko. </w:t>
-      </w:r>
-      <w:r>
-        <w:t xml:space="preserve">Poradil jsem se s vedoucím (panem Kazdou) a ten mi </w:t>
-      </w:r>
+    <w:p>
+      <w:pPr>
+        <w:ind w:firstLine="0"/>
+      </w:pPr>
+    </w:p>
+    <w:p>
+      <w:pPr>
+        <w:ind w:firstLine="0"/>
+      </w:pPr>
+    </w:p>
+    <w:p>
+      <w:r>
+        <w:t xml:space="preserve">Jelikož autíčko bude používáno především pro školní účely, při </w:t>
+      </w:r>
+      <w:r>
+        <w:t>výběru</w:t>
+      </w:r>
+      <w:r>
+        <w:t xml:space="preserve"> komponent jsem se primárně radil s vedoucím práce, abychom jsme si </w:t>
+      </w:r>
+      <w:r>
+        <w:t>vzájemn</w:t>
+      </w:r>
+      <w:r>
+        <w:t>ě</w:t>
+      </w:r>
+      <w:r>
+        <w:t xml:space="preserve"> porozumě</w:t>
+      </w:r>
+      <w:r>
+        <w:t xml:space="preserve">li a </w:t>
+      </w:r>
+      <w:r>
+        <w:t>výsledný</w:t>
+      </w:r>
+      <w:r>
+        <w:t xml:space="preserve"> produkt byl funkční přesně podle požadavku</w:t>
+      </w:r>
+      <w:r>
+        <w:t xml:space="preserve"> a účelu použití</w:t>
+      </w:r>
+      <w:r>
+        <w:t>.</w:t>
+      </w:r>
+      <w:r>
+        <w:t xml:space="preserve"> </w:t>
+      </w:r>
+    </w:p>
+    <w:p>
+      <w:pPr>
+        <w:rPr>
+          <w:lang w:val="uk-UA"/>
+        </w:rPr>
+      </w:pPr>
+      <w:r>
+        <w:t xml:space="preserve">Základem celého systému se stal britský mikrokontroler </w:t>
+      </w:r>
+      <w:proofErr w:type="spellStart"/>
+      <w:proofErr w:type="gramStart"/>
+      <w:r>
+        <w:t>Micro:Bit</w:t>
+      </w:r>
+      <w:proofErr w:type="spellEnd"/>
+      <w:proofErr w:type="gramEnd"/>
     </w:p>
     <w:p>
       <w:pPr>
@@ -3751,7 +3792,15 @@
       </w:pPr>
       <w:bookmarkStart w:id="9" w:name="_Toc229472325"/>
       <w:r>
-        <w:t>Modelování ve Fusion 360</w:t>
+        <w:t xml:space="preserve">Modelování ve </w:t>
+      </w:r>
+      <w:proofErr w:type="spellStart"/>
+      <w:r>
+        <w:t>Fusion</w:t>
+      </w:r>
+      <w:proofErr w:type="spellEnd"/>
+      <w:r>
+        <w:t xml:space="preserve"> 360</w:t>
       </w:r>
       <w:bookmarkEnd w:id="9"/>
     </w:p>
@@ -3762,7 +3811,25 @@
     </w:p>
     <w:p>
       <w:r>
-        <w:t>Návrh s ohledem na umístění Micro:bitu, motorů a vedení kabelů (wiring).</w:t>
+        <w:t xml:space="preserve">Návrh s ohledem na umístění </w:t>
+      </w:r>
+      <w:proofErr w:type="spellStart"/>
+      <w:proofErr w:type="gramStart"/>
+      <w:r>
+        <w:t>Micro:bitu</w:t>
+      </w:r>
+      <w:proofErr w:type="spellEnd"/>
+      <w:proofErr w:type="gramEnd"/>
+      <w:r>
+        <w:t>, motorů a vedení kabelů (</w:t>
+      </w:r>
+      <w:proofErr w:type="spellStart"/>
+      <w:r>
+        <w:t>wiring</w:t>
+      </w:r>
+      <w:proofErr w:type="spellEnd"/>
+      <w:r>
+        <w:t>).</w:t>
       </w:r>
     </w:p>
     <w:p>
@@ -3808,7 +3875,15 @@
     </w:p>
     <w:p>
       <w:r>
-        <w:t>(Tvoje práce s MakeCode)</w:t>
+        <w:t xml:space="preserve">(Tvoje práce s </w:t>
+      </w:r>
+      <w:proofErr w:type="spellStart"/>
+      <w:r>
+        <w:t>MakeCode</w:t>
+      </w:r>
+      <w:proofErr w:type="spellEnd"/>
+      <w:r>
+        <w:t>)</w:t>
       </w:r>
     </w:p>
     <w:p>
@@ -3874,7 +3949,31 @@
       </w:pPr>
       <w:bookmarkStart w:id="16" w:name="_Toc229472332"/>
       <w:r>
-        <w:t>Seznam součástek (BOM - Bill of Materials)</w:t>
+        <w:t>Seznam součástek (</w:t>
+      </w:r>
+      <w:proofErr w:type="gramStart"/>
+      <w:r>
+        <w:t>BOM - Bill</w:t>
+      </w:r>
+      <w:proofErr w:type="gramEnd"/>
+      <w:r>
+        <w:t xml:space="preserve"> </w:t>
+      </w:r>
+      <w:proofErr w:type="spellStart"/>
+      <w:r>
+        <w:t>of</w:t>
+      </w:r>
+      <w:proofErr w:type="spellEnd"/>
+      <w:r>
+        <w:t xml:space="preserve"> </w:t>
+      </w:r>
+      <w:proofErr w:type="spellStart"/>
+      <w:r>
+        <w:t>Materials</w:t>
+      </w:r>
+      <w:proofErr w:type="spellEnd"/>
+      <w:r>
+        <w:t>)</w:t>
       </w:r>
       <w:bookmarkEnd w:id="16"/>
     </w:p>
@@ -3895,7 +3994,23 @@
     </w:p>
     <w:p>
       <w:r>
-        <w:t>Doporučený materiál (PLA/PETG), výplň (infill), případně nutnost podpor (supports).</w:t>
+        <w:t>Doporučený materiál (PLA/PETG), výplň (</w:t>
+      </w:r>
+      <w:proofErr w:type="spellStart"/>
+      <w:r>
+        <w:t>infill</w:t>
+      </w:r>
+      <w:proofErr w:type="spellEnd"/>
+      <w:r>
+        <w:t>), případně nutnost podpor (</w:t>
+      </w:r>
+      <w:proofErr w:type="spellStart"/>
+      <w:r>
+        <w:t>supports</w:t>
+      </w:r>
+      <w:proofErr w:type="spellEnd"/>
+      <w:r>
+        <w:t>).</w:t>
       </w:r>
     </w:p>
     <w:p>
@@ -3925,7 +4040,15 @@
     </w:p>
     <w:p>
       <w:r>
-        <w:t>Jak přesně zapojit kabely (wiring), jaké jsou naměřené a doporučené délky kabelů.</w:t>
+        <w:t>Jak přesně zapojit kabely (</w:t>
+      </w:r>
+      <w:proofErr w:type="spellStart"/>
+      <w:r>
+        <w:t>wiring</w:t>
+      </w:r>
+      <w:proofErr w:type="spellEnd"/>
+      <w:r>
+        <w:t>), jaké jsou naměřené a doporučené délky kabelů.</w:t>
       </w:r>
     </w:p>
     <w:p>
@@ -3940,7 +4063,15 @@
     </w:p>
     <w:p>
       <w:r>
-        <w:t>Jak nahrát tvou MakeCode knihovnu a spustit první testovací kód.</w:t>
+        <w:t xml:space="preserve">Jak nahrát tvou </w:t>
+      </w:r>
+      <w:proofErr w:type="spellStart"/>
+      <w:r>
+        <w:t>MakeCode</w:t>
+      </w:r>
+      <w:proofErr w:type="spellEnd"/>
+      <w:r>
+        <w:t xml:space="preserve"> knihovnu a spustit první testovací kód.</w:t>
       </w:r>
     </w:p>
     <w:p>
@@ -4025,9 +4156,27 @@
       <w:pPr>
         <w:pStyle w:val="Vysvtlenpojmu"/>
       </w:pPr>
-      <w:r>
-        <w:t>HyperText Markup Language</w:t>
-      </w:r>
+      <w:proofErr w:type="spellStart"/>
+      <w:r>
+        <w:t>HyperText</w:t>
+      </w:r>
+      <w:proofErr w:type="spellEnd"/>
+      <w:r>
+        <w:t xml:space="preserve"> </w:t>
+      </w:r>
+      <w:proofErr w:type="spellStart"/>
+      <w:r>
+        <w:t>Markup</w:t>
+      </w:r>
+      <w:proofErr w:type="spellEnd"/>
+      <w:r>
+        <w:t xml:space="preserve"> </w:t>
+      </w:r>
+      <w:proofErr w:type="spellStart"/>
+      <w:r>
+        <w:t>Language</w:t>
+      </w:r>
+      <w:proofErr w:type="spellEnd"/>
       <w:r>
         <w:t xml:space="preserve"> – značkovací jazyk používaný pro tvorbu webových stránek.</w:t>
       </w:r>
@@ -7315,14 +7464,18 @@
     <w:rsid w:val="00365CB3"/>
     <w:rsid w:val="00396286"/>
     <w:rsid w:val="00403C92"/>
+    <w:rsid w:val="0052084C"/>
     <w:rsid w:val="005C2EE2"/>
     <w:rsid w:val="00895716"/>
     <w:rsid w:val="009A24FD"/>
     <w:rsid w:val="00B2273F"/>
+    <w:rsid w:val="00C16B87"/>
     <w:rsid w:val="00D44DBC"/>
     <w:rsid w:val="00D56427"/>
     <w:rsid w:val="00E21147"/>
     <w:rsid w:val="00FA324C"/>
+    <w:rsid w:val="00FA51BB"/>
+    <w:rsid w:val="00FC5F60"/>
   </w:rsids>
   <m:mathPr>
     <m:mathFont m:val="Cambria Math"/>

</xml_diff>